<commit_message>
Spis tresci: bez spisow i zalacznikow, naglowek Bibliografia
Co-Authored-By: Claude Opus 5.5 <noreply@anthropic.com>
Claude-Session: https://claude.ai/code/session_011Q4ZBdBgGW1wjGjN29SKNp
</commit_message>
<xml_diff>
--- a/docs/spis-tresci.docx
+++ b/docs/spis-tresci.docx
@@ -423,77 +423,12 @@
     </w:p>
     <w:p>
       <w:pPr>
-        <w:spacing w:before="240"/>
-      </w:pPr>
-    </w:p>
-    <w:p>
-      <w:pPr>
-        <w:spacing w:after="40"/>
-      </w:pPr>
-      <w:r>
-        <w:rPr>
-          <w:b/>
-          <w:bCs/>
-        </w:rPr>
-        <w:t xml:space="preserve">Bibliografia</w:t>
-      </w:r>
-    </w:p>
-    <w:p>
-      <w:pPr>
-        <w:spacing w:after="40"/>
-      </w:pPr>
-      <w:r>
-        <w:rPr>
-          <w:b/>
-          <w:bCs/>
-        </w:rPr>
-        <w:t xml:space="preserve">Spis rysunków</w:t>
-      </w:r>
-    </w:p>
-    <w:p>
-      <w:pPr>
-        <w:spacing w:after="40"/>
-      </w:pPr>
-      <w:r>
-        <w:rPr>
-          <w:b/>
-          <w:bCs/>
-        </w:rPr>
-        <w:t xml:space="preserve">Spis tabel</w:t>
-      </w:r>
-    </w:p>
-    <w:p>
-      <w:pPr>
-        <w:spacing w:after="40"/>
-      </w:pPr>
-      <w:r>
-        <w:rPr>
-          <w:b/>
-          <w:bCs/>
-        </w:rPr>
-        <w:t xml:space="preserve">Spis listingów</w:t>
-      </w:r>
-    </w:p>
-    <w:p>
-      <w:pPr>
-        <w:spacing w:after="40"/>
-      </w:pPr>
-      <w:r>
-        <w:rPr>
-          <w:b/>
-          <w:bCs/>
-        </w:rPr>
-        <w:t xml:space="preserve">Załączniki</w:t>
-      </w:r>
-    </w:p>
-    <w:p>
-      <w:pPr>
         <w:pStyle w:val="Heading1"/>
         <w:pageBreakBefore/>
         <w:spacing w:after="240"/>
       </w:pPr>
       <w:r>
-        <w:t xml:space="preserve">Wstępna bibliografia</w:t>
+        <w:t xml:space="preserve">Bibliografia</w:t>
       </w:r>
     </w:p>
     <w:p>
@@ -520,7 +455,7 @@
         <w:spacing w:after="40"/>
         <w:ind w:left="567"/>
       </w:pPr>
-      <w:hyperlink w:history="1" r:id="rIdjwwtnc_8x57bewlbngokf">
+      <w:hyperlink w:history="1" r:id="rIdfqzvl8qvi6-c6mhl8olf7">
         <w:r>
           <w:rPr>
             <w:rStyle w:val="Hyperlink"/>
@@ -567,7 +502,7 @@
         <w:spacing w:after="40"/>
         <w:ind w:left="567"/>
       </w:pPr>
-      <w:hyperlink w:history="1" r:id="rId_z_b4bny_gqexwf4imvmt">
+      <w:hyperlink w:history="1" r:id="rIdtyqkyz-asjywlstxzpn62">
         <w:r>
           <w:rPr>
             <w:rStyle w:val="Hyperlink"/>
@@ -614,7 +549,7 @@
         <w:spacing w:after="40"/>
         <w:ind w:left="567"/>
       </w:pPr>
-      <w:hyperlink w:history="1" r:id="rIdgl4nhhli710uwwt-kf7qd">
+      <w:hyperlink w:history="1" r:id="rIdcftgqlpmqidg0wroyojci">
         <w:r>
           <w:rPr>
             <w:rStyle w:val="Hyperlink"/>
@@ -661,7 +596,7 @@
         <w:spacing w:after="40"/>
         <w:ind w:left="567"/>
       </w:pPr>
-      <w:hyperlink w:history="1" r:id="rIdq9ysd9z-wxlqvvwzsbjyg">
+      <w:hyperlink w:history="1" r:id="rIdjrwkjbookrd96zyt2raok">
         <w:r>
           <w:rPr>
             <w:rStyle w:val="Hyperlink"/>
@@ -708,7 +643,7 @@
         <w:spacing w:after="40"/>
         <w:ind w:left="567"/>
       </w:pPr>
-      <w:hyperlink w:history="1" r:id="rIdxbp-81mvpltxa5vohj1zt">
+      <w:hyperlink w:history="1" r:id="rIdmyy9qotlohhpi847hfkxe">
         <w:r>
           <w:rPr>
             <w:rStyle w:val="Hyperlink"/>

</xml_diff>

<commit_message>
Spis tresci: usuniety kierunek z naglowka
Co-Authored-By: Claude Opus 5.5 <noreply@anthropic.com>
Claude-Session: https://claude.ai/code/session_011Q4ZBdBgGW1wjGjN29SKNp
</commit_message>
<xml_diff>
--- a/docs/spis-tresci.docx
+++ b/docs/spis-tresci.docx
@@ -28,7 +28,7 @@
           <w:sz w:val="22"/>
           <w:szCs w:val="22"/>
         </w:rPr>
-        <w:t xml:space="preserve">Daniel Kubiela · Technologie Informatyczne · praca inżynierska</w:t>
+        <w:t xml:space="preserve">Daniel Kubiela · praca inżynierska</w:t>
       </w:r>
     </w:p>
     <w:p>
@@ -455,7 +455,7 @@
         <w:spacing w:after="40"/>
         <w:ind w:left="567"/>
       </w:pPr>
-      <w:hyperlink w:history="1" r:id="rIdfqzvl8qvi6-c6mhl8olf7">
+      <w:hyperlink w:history="1" r:id="rIddreao9kf0ssx1zjaidny2">
         <w:r>
           <w:rPr>
             <w:rStyle w:val="Hyperlink"/>
@@ -502,7 +502,7 @@
         <w:spacing w:after="40"/>
         <w:ind w:left="567"/>
       </w:pPr>
-      <w:hyperlink w:history="1" r:id="rIdtyqkyz-asjywlstxzpn62">
+      <w:hyperlink w:history="1" r:id="rIdyg5j82jm1cprahprha3xv">
         <w:r>
           <w:rPr>
             <w:rStyle w:val="Hyperlink"/>
@@ -549,7 +549,7 @@
         <w:spacing w:after="40"/>
         <w:ind w:left="567"/>
       </w:pPr>
-      <w:hyperlink w:history="1" r:id="rIdcftgqlpmqidg0wroyojci">
+      <w:hyperlink w:history="1" r:id="rIdtguttuwxpxkxkr4vcuug9">
         <w:r>
           <w:rPr>
             <w:rStyle w:val="Hyperlink"/>
@@ -596,7 +596,7 @@
         <w:spacing w:after="40"/>
         <w:ind w:left="567"/>
       </w:pPr>
-      <w:hyperlink w:history="1" r:id="rIdjrwkjbookrd96zyt2raok">
+      <w:hyperlink w:history="1" r:id="rIdpdgobszfmr4i0xa464-9a">
         <w:r>
           <w:rPr>
             <w:rStyle w:val="Hyperlink"/>
@@ -643,7 +643,7 @@
         <w:spacing w:after="40"/>
         <w:ind w:left="567"/>
       </w:pPr>
-      <w:hyperlink w:history="1" r:id="rIdmyy9qotlohhpi847hfkxe">
+      <w:hyperlink w:history="1" r:id="rId11lcysed8u9gxp8di5nss">
         <w:r>
           <w:rPr>
             <w:rStyle w:val="Hyperlink"/>

</xml_diff>

<commit_message>
Bibliografia: artykuly zamiast RFC, zostaje NIST SP 800-94
Co-Authored-By: Claude Opus 5.5 <noreply@anthropic.com>
Claude-Session: https://claude.ai/code/session_011Q4ZBdBgGW1wjGjN29SKNp
</commit_message>
<xml_diff>
--- a/docs/spis-tresci.docx
+++ b/docs/spis-tresci.docx
@@ -437,30 +437,30 @@
         <w:ind w:left="567" w:hanging="567"/>
       </w:pPr>
       <w:r>
-        <w:t xml:space="preserve">[1]	Rescorla E., </w:t>
+        <w:t xml:space="preserve">[1]	Sullivan N., </w:t>
       </w:r>
       <w:r>
         <w:rPr>
           <w:i/>
           <w:iCs/>
         </w:rPr>
-        <w:t xml:space="preserve">The Transport Layer Security (TLS) Protocol Version 1.3</w:t>
-      </w:r>
-      <w:r>
-        <w:t xml:space="preserve">, RFC 9846, IETF, 2026.</w:t>
-      </w:r>
-    </w:p>
-    <w:p>
-      <w:pPr>
-        <w:spacing w:after="40"/>
-        <w:ind w:left="567"/>
-      </w:pPr>
-      <w:hyperlink w:history="1" r:id="rIddreao9kf0ssx1zjaidny2">
+        <w:t xml:space="preserve">A Detailed Look at RFC 8446 (a.k.a. TLS 1.3)</w:t>
+      </w:r>
+      <w:r>
+        <w:t xml:space="preserve">, The Cloudflare Blog, 2018.</w:t>
+      </w:r>
+    </w:p>
+    <w:p>
+      <w:pPr>
+        <w:spacing w:after="40"/>
+        <w:ind w:left="567"/>
+      </w:pPr>
+      <w:hyperlink w:history="1" r:id="rIdlyqeu8utazcorsuq2zvds">
         <w:r>
           <w:rPr>
             <w:rStyle w:val="Hyperlink"/>
           </w:rPr>
-          <w:t xml:space="preserve">https://www.rfc-editor.org/rfc/rfc9846</w:t>
+          <w:t xml:space="preserve">https://blog.cloudflare.com/rfc-8446-aka-tls-1-3/</w:t>
         </w:r>
       </w:hyperlink>
     </w:p>
@@ -475,7 +475,7 @@
           <w:sz w:val="20"/>
           <w:szCs w:val="20"/>
         </w:rPr>
-        <w:t xml:space="preserve">Zastępuje RFC 8446 i RFC 5246. Rozdz. 2.6, 4.2.</w:t>
+        <w:t xml:space="preserve">Rozdz. 2.6, 4.2.</w:t>
       </w:r>
     </w:p>
     <w:p>
@@ -484,30 +484,30 @@
         <w:ind w:left="567" w:hanging="567"/>
       </w:pPr>
       <w:r>
-        <w:t xml:space="preserve">[2]	Krawczyk H., Bellare M., Canetti R., </w:t>
+        <w:t xml:space="preserve">[2]	Latacora, </w:t>
       </w:r>
       <w:r>
         <w:rPr>
           <w:i/>
           <w:iCs/>
         </w:rPr>
-        <w:t xml:space="preserve">HMAC: Keyed-Hashing for Message Authentication</w:t>
-      </w:r>
-      <w:r>
-        <w:t xml:space="preserve">, RFC 2104, IETF, 1997.</w:t>
-      </w:r>
-    </w:p>
-    <w:p>
-      <w:pPr>
-        <w:spacing w:after="40"/>
-        <w:ind w:left="567"/>
-      </w:pPr>
-      <w:hyperlink w:history="1" r:id="rIdyg5j82jm1cprahprha3xv">
+        <w:t xml:space="preserve">Cryptographic Right Answers</w:t>
+      </w:r>
+      <w:r>
+        <w:t xml:space="preserve">, 2018.</w:t>
+      </w:r>
+    </w:p>
+    <w:p>
+      <w:pPr>
+        <w:spacing w:after="40"/>
+        <w:ind w:left="567"/>
+      </w:pPr>
+      <w:hyperlink w:history="1" r:id="rId1oz1ejovvx4yjykrjhoxf">
         <w:r>
           <w:rPr>
             <w:rStyle w:val="Hyperlink"/>
           </w:rPr>
-          <w:t xml:space="preserve">https://www.rfc-editor.org/rfc/rfc2104</w:t>
+          <w:t xml:space="preserve">https://www.latacora.com/blog/cryptographic-right-answers/</w:t>
         </w:r>
       </w:hyperlink>
     </w:p>
@@ -522,7 +522,7 @@
           <w:sz w:val="20"/>
           <w:szCs w:val="20"/>
         </w:rPr>
-        <w:t xml:space="preserve">Rozdz. 2.4, 4.5.</w:t>
+        <w:t xml:space="preserve">Rozdz. 2.3, 2.4, 4.4, 4.5, 7.2.</w:t>
       </w:r>
     </w:p>
     <w:p>
@@ -531,30 +531,30 @@
         <w:ind w:left="567" w:hanging="567"/>
       </w:pPr>
       <w:r>
-        <w:t xml:space="preserve">[3]	Biryukov A., Dinu D., Khovratovich D., Josefsson S., </w:t>
+        <w:t xml:space="preserve">[3]	Percival C., </w:t>
       </w:r>
       <w:r>
         <w:rPr>
           <w:i/>
           <w:iCs/>
         </w:rPr>
-        <w:t xml:space="preserve">Argon2 Memory-Hard Function for Password Hashing and Proof-of-Work Applications</w:t>
-      </w:r>
-      <w:r>
-        <w:t xml:space="preserve">, RFC 9106, IETF, 2021.</w:t>
-      </w:r>
-    </w:p>
-    <w:p>
-      <w:pPr>
-        <w:spacing w:after="40"/>
-        <w:ind w:left="567"/>
-      </w:pPr>
-      <w:hyperlink w:history="1" r:id="rIdtguttuwxpxkxkr4vcuug9">
+        <w:t xml:space="preserve">Stronger Key Derivation via Sequential Memory-Hard Functions</w:t>
+      </w:r>
+      <w:r>
+        <w:t xml:space="preserve">, BSDCan 2009.</w:t>
+      </w:r>
+    </w:p>
+    <w:p>
+      <w:pPr>
+        <w:spacing w:after="40"/>
+        <w:ind w:left="567"/>
+      </w:pPr>
+      <w:hyperlink w:history="1" r:id="rIdu9w9orqt201jkqwbqhy6x">
         <w:r>
           <w:rPr>
             <w:rStyle w:val="Hyperlink"/>
           </w:rPr>
-          <w:t xml:space="preserve">https://www.rfc-editor.org/rfc/rfc9106</w:t>
+          <w:t xml:space="preserve">https://www.tarsnap.com/scrypt/scrypt.pdf</w:t>
         </w:r>
       </w:hyperlink>
     </w:p>
@@ -578,30 +578,30 @@
         <w:ind w:left="567" w:hanging="567"/>
       </w:pPr>
       <w:r>
-        <w:t xml:space="preserve">[4]	NIST, </w:t>
+        <w:t xml:space="preserve">[4]	Lyda R., Hamrock J., </w:t>
       </w:r>
       <w:r>
         <w:rPr>
           <w:i/>
           <w:iCs/>
         </w:rPr>
-        <w:t xml:space="preserve">Digital Identity Guidelines: Authentication and Authenticator Management</w:t>
-      </w:r>
-      <w:r>
-        <w:t xml:space="preserve">, NIST SP 800-63B-4, 2025.</w:t>
-      </w:r>
-    </w:p>
-    <w:p>
-      <w:pPr>
-        <w:spacing w:after="40"/>
-        <w:ind w:left="567"/>
-      </w:pPr>
-      <w:hyperlink w:history="1" r:id="rIdpdgobszfmr4i0xa464-9a">
+        <w:t xml:space="preserve">Using Entropy Analysis to Find Encrypted and Packed Malware</w:t>
+      </w:r>
+      <w:r>
+        <w:t xml:space="preserve">, IEEE Security &amp; Privacy, vol. 5, nr 2, 2007.</w:t>
+      </w:r>
+    </w:p>
+    <w:p>
+      <w:pPr>
+        <w:spacing w:after="40"/>
+        <w:ind w:left="567"/>
+      </w:pPr>
+      <w:hyperlink w:history="1" r:id="rIdvxsbam71habumvk2t76xq">
         <w:r>
           <w:rPr>
             <w:rStyle w:val="Hyperlink"/>
           </w:rPr>
-          <w:t xml:space="preserve">https://csrc.nist.gov/pubs/sp/800/63/b/4/final</w:t>
+          <w:t xml:space="preserve">https://ieeexplore.ieee.org/document/4140989</w:t>
         </w:r>
       </w:hyperlink>
     </w:p>
@@ -616,7 +616,7 @@
           <w:sz w:val="20"/>
           <w:szCs w:val="20"/>
         </w:rPr>
-        <w:t xml:space="preserve">Rozdz. 5.5, 7.2.</w:t>
+        <w:t xml:space="preserve">Rozdz. 6.2.</w:t>
       </w:r>
     </w:p>
     <w:p>
@@ -643,7 +643,7 @@
         <w:spacing w:after="40"/>
         <w:ind w:left="567"/>
       </w:pPr>
-      <w:hyperlink w:history="1" r:id="rId11lcysed8u9gxp8di5nss">
+      <w:hyperlink w:history="1" r:id="rIdqr7hknbrsrt5nfi8aiugw">
         <w:r>
           <w:rPr>
             <w:rStyle w:val="Hyperlink"/>

</xml_diff>